<commit_message>
Första incheckningen av EDA
</commit_message>
<xml_diff>
--- a/Diskussionsfrågor.docx
+++ b/Diskussionsfrågor.docx
@@ -204,24 +204,92 @@
         <w:t xml:space="preserve"> av Jaron Lanier får man ett intressant perspektiv. Lanier menar att vi inte ska se AI s</w:t>
       </w:r>
       <w:r>
-        <w:t>om en sorts självständig varelse eller en ”ny livsform”. Han ser det snarare som ett nytt sätt att paketera mänskligt samarbete och data. Om vi, som Kalle, bara säger att utveckling alltid är bra så missar vi att det är människor som äger och styr tekniken.</w:t>
-      </w:r>
-    </w:p>
-    <w:p>
-      <w:pPr>
-        <w:jc w:val="both"/>
-      </w:pPr>
-      <w:r>
-        <w:t xml:space="preserve">Johanna har en viktig poäng gällande maktkoncentration. Om bara ett fåtal gigantiska företag i USA eller Kina äger de modeller vi alla använder, så får de en enorm makt över hur vi ser på världen. Etiska problem som </w:t>
+        <w:t>om en sorts självständig varelse eller en ny livsform. Han ser det snarare som ett nytt sätt att paketera mänskligt samarbete och data. Om vi som Kalle, bara säger att utveckling alltid är bra så missar vi att det är människor som äger och styr tekniken.</w:t>
+      </w:r>
+    </w:p>
+    <w:p>
+      <w:pPr>
+        <w:jc w:val="both"/>
+      </w:pPr>
+      <w:r>
+        <w:t>Johanna har en viktig poäng gällande maktkoncentration. Om bara ett fåtal gigantiska företag i USA</w:t>
+      </w:r>
+      <w:r>
+        <w:t xml:space="preserve"> (Mag7) </w:t>
+      </w:r>
+      <w:r>
+        <w:t xml:space="preserve"> eller Kina äger de modeller vi alla använder, så får de en enorm makt över hur vi ser på världen. Etiska problem som </w:t>
       </w:r>
       <w:r>
         <w:t>deepfakes</w:t>
       </w:r>
       <w:r>
-        <w:t xml:space="preserve"> är inte heller bara små sidoproblem. De hotar själva grunden för hur vi litar på varandra. Om man inte längre kan tro på en video av en politiker eller en vän, vad händer då med samhället? Som nybörjare i Python inser man snabbt att en AI bara gör vad den blir tillsagd baserat på data – den har ingen egen moral. Därför måste vi människor stå för moralen precis som Johanna säger.</w:t>
+        <w:t xml:space="preserve"> är inte heller bara små sidoproblem. De hotar själva grunden för hur vi litar på varandra. Om man inte längre kan tro på en video av en politiker eller en vän vad händer då med samhället? Som nybörjare i Python inser man snabbt att en AI bara gör vad den blir tillsagd baserat på data – den har ingen egen moral. Därför måste vi människor stå för moralen precis som Johanna säger.</w:t>
       </w:r>
       <w:r>
         <w:t xml:space="preserve"> Jag tror att det kommer att komma ett bakslag för AI snart. Antingen beroende på ett beslut taget på information från en AI som får katastodfala konsekvenser eller att det blir en börskrasch på AI-aktier. </w:t>
+      </w:r>
+    </w:p>
+    <w:p>
+      <w:pPr>
+        <w:jc w:val="both"/>
+      </w:pPr>
+    </w:p>
+    <w:p>
+      <w:pPr>
+        <w:jc w:val="both"/>
+        <w:rPr>
+          <w:sz w:val="20"/>
+          <w:szCs w:val="20"/>
+        </w:rPr>
+      </w:pPr>
+      <w:r>
+        <w:rPr>
+          <w:b/>
+          <w:bCs/>
+          <w:sz w:val="20"/>
+          <w:szCs w:val="20"/>
+        </w:rPr>
+        <w:t>Mag 7 </w:t>
+      </w:r>
+      <w:r>
+        <w:rPr>
+          <w:sz w:val="20"/>
+          <w:szCs w:val="20"/>
+        </w:rPr>
+        <w:t>(kort för </w:t>
+      </w:r>
+      <w:r>
+        <w:rPr>
+          <w:i/>
+          <w:iCs/>
+          <w:sz w:val="20"/>
+          <w:szCs w:val="20"/>
+        </w:rPr>
+        <w:t>The Magnificent Seven</w:t>
+      </w:r>
+      <w:r>
+        <w:rPr>
+          <w:sz w:val="20"/>
+          <w:szCs w:val="20"/>
+        </w:rPr>
+        <w:t xml:space="preserve">) är ett samlingsnamn för sju av världens största och mest inflytelserika teknikbolag. Gruppen har under de senaste åren haft en enorm påverkan på utvecklingen för globala aktieindex (som amerikanska S&amp;P 500) </w:t>
+      </w:r>
+    </w:p>
+    <w:p>
+      <w:pPr>
+        <w:jc w:val="both"/>
+        <w:rPr>
+          <w:sz w:val="20"/>
+          <w:szCs w:val="20"/>
+        </w:rPr>
+      </w:pPr>
+      <w:r>
+        <w:rPr>
+          <w:sz w:val="20"/>
+          <w:szCs w:val="20"/>
+        </w:rPr>
+        <w:t>Microsoft, Apple, Nvidia, Amazon, Meta Platforms, Alphabet (Google), Tesla</w:t>
       </w:r>
     </w:p>
     <w:p>
@@ -319,7 +387,11 @@
         <w:t>a formler</w:t>
       </w:r>
       <w:r>
-        <w:t xml:space="preserve"> kraschar och då kan AI:n förklara felet på ett sätt som en lärobok inte alltid gör. S</w:t>
+        <w:t xml:space="preserve"> kraschar och då kan AI:n förklara </w:t>
+      </w:r>
+      <w:r>
+        <w:lastRenderedPageBreak/>
+        <w:t>felet på ett sätt som en lärobok inte alltid gör. S</w:t>
       </w:r>
       <w:r>
         <w:t xml:space="preserve">å </w:t>
@@ -337,7 +409,6 @@
         <w:t xml:space="preserve"> kan förbättra resultaten om vi använder det som ett stödverktyg för att förstå svåra saker men det kan förstöra skolan om det bara blir en genväg för att slippa tänka. Vi </w:t>
       </w:r>
       <w:r>
-        <w:lastRenderedPageBreak/>
         <w:t xml:space="preserve">måste nog ändra på hur vi examineras kanske mer muntliga prov eller att vi skriver </w:t>
       </w:r>
       <w:r>
@@ -458,31 +529,6 @@
     <w:p>
       <w:pPr>
         <w:jc w:val="both"/>
-      </w:pPr>
-      <w:r>
-        <w:rPr>
-          <w:b/>
-          <w:bCs/>
-        </w:rPr>
-        <w:t>Personliga rekommendationer:</w:t>
-      </w:r>
-      <w:r>
-        <w:t xml:space="preserve"> Allt från vad du ska se på Netflix till vad du ska köpa på nätet styrs av algoritmer som lär sig vad du gillar.</w:t>
-      </w:r>
-    </w:p>
-    <w:p>
-      <w:pPr>
-        <w:jc w:val="both"/>
-        <w:rPr>
-          <w:rFonts w:asciiTheme="majorHAnsi" w:hAnsiTheme="majorHAnsi"/>
-          <w:b/>
-          <w:bCs/>
-        </w:rPr>
-      </w:pPr>
-    </w:p>
-    <w:p>
-      <w:pPr>
-        <w:jc w:val="both"/>
         <w:rPr>
           <w:rFonts w:asciiTheme="majorHAnsi" w:hAnsiTheme="majorHAnsi"/>
           <w:b/>
@@ -708,7 +754,7 @@
       </w:r>
       <w:r>
         <w:lastRenderedPageBreak/>
-        <w:t>miljontals meningar där de orden hänger ihop. Den har inget medvetande, ingen moral och ingen logik – den är bara en extremt avancerad ord</w:t>
+        <w:t>miljontals meningar där de orden hänger ihop. Den har inget medvetande, ingen moral och ingen logik den är bara en extremt avancerad ord</w:t>
       </w:r>
       <w:r>
         <w:t>-</w:t>
@@ -1752,7 +1798,7 @@
         <w:jc w:val="both"/>
       </w:pPr>
       <w:r>
-        <w:t xml:space="preserve">Som nybörjare tror man lätt att man bara skriver en AI men det är en hel process. </w:t>
+        <w:t xml:space="preserve">Som nybörjare tror man att man bara skriver en AI men det är en hel process. </w:t>
       </w:r>
     </w:p>
     <w:p>
@@ -1891,7 +1937,13 @@
         <w:jc w:val="both"/>
       </w:pPr>
       <w:r>
-        <w:t>Driftsättning och underhåll: Vi börjar använda modellen på riktigt. Men man måste fortsätta hålla koll på den för världen ändras och då kanske modellen slutar fungera bra efter ett tag.</w:t>
+        <w:t>Driftsättning och underhåll: Vi börjar använda modellen på riktigt.</w:t>
+      </w:r>
+      <w:r>
+        <w:t xml:space="preserve"> M</w:t>
+      </w:r>
+      <w:r>
+        <w:t>an måste fortsätta hålla koll på den för världen ändras och då kanske modellen slutar fungera bra efter ett tag.</w:t>
       </w:r>
     </w:p>
     <w:p>
@@ -1962,7 +2014,7 @@
         <w:t xml:space="preserve">analyser och riskutredningar.   </w:t>
       </w:r>
       <w:r>
-        <w:t xml:space="preserve">   </w:t>
+        <w:t xml:space="preserve">  </w:t>
       </w:r>
     </w:p>
     <w:p>
@@ -2055,6 +2107,7 @@
           <w:docPartUnique/>
         </w:docPartObj>
       </w:sdtPr>
+      <w:sdtEndPr/>
       <w:sdtContent>
         <w:r>
           <w:rPr>
@@ -2147,7 +2200,7 @@
           <wp:extent cx="720000" cy="720000"/>
           <wp:effectExtent l="0" t="0" r="4445" b="4445"/>
           <wp:wrapNone/>
-          <wp:docPr id="1823768426" name="Bildobjekt 1" descr="NBI/Handelsakademin - Skapa din egen framtid!"/>
+          <wp:docPr id="1733249747" name="Bildobjekt 1" descr="NBI/Handelsakademin - Skapa din egen framtid!"/>
           <wp:cNvGraphicFramePr>
             <a:graphicFrameLocks xmlns:a="http://schemas.openxmlformats.org/drawingml/2006/main" noChangeAspect="1"/>
           </wp:cNvGraphicFramePr>
@@ -3153,6 +3206,155 @@
     </w:lvl>
   </w:abstractNum>
   <w:abstractNum w:abstractNumId="7" w15:restartNumberingAfterBreak="0">
+    <w:nsid w:val="5ABB738B"/>
+    <w:multiLevelType w:val="multilevel"/>
+    <w:tmpl w:val="B8FC26C6"/>
+    <w:lvl w:ilvl="0">
+      <w:start w:val="1"/>
+      <w:numFmt w:val="bullet"/>
+      <w:lvlText w:val=""/>
+      <w:lvlJc w:val="left"/>
+      <w:pPr>
+        <w:tabs>
+          <w:tab w:val="num" w:pos="720"/>
+        </w:tabs>
+        <w:ind w:left="720" w:hanging="360"/>
+      </w:pPr>
+      <w:rPr>
+        <w:rFonts w:ascii="Symbol" w:hAnsi="Symbol" w:hint="default"/>
+        <w:sz w:val="20"/>
+      </w:rPr>
+    </w:lvl>
+    <w:lvl w:ilvl="1" w:tentative="1">
+      <w:start w:val="1"/>
+      <w:numFmt w:val="bullet"/>
+      <w:lvlText w:val="o"/>
+      <w:lvlJc w:val="left"/>
+      <w:pPr>
+        <w:tabs>
+          <w:tab w:val="num" w:pos="1440"/>
+        </w:tabs>
+        <w:ind w:left="1440" w:hanging="360"/>
+      </w:pPr>
+      <w:rPr>
+        <w:rFonts w:ascii="Courier New" w:hAnsi="Courier New" w:hint="default"/>
+        <w:sz w:val="20"/>
+      </w:rPr>
+    </w:lvl>
+    <w:lvl w:ilvl="2" w:tentative="1">
+      <w:start w:val="1"/>
+      <w:numFmt w:val="bullet"/>
+      <w:lvlText w:val=""/>
+      <w:lvlJc w:val="left"/>
+      <w:pPr>
+        <w:tabs>
+          <w:tab w:val="num" w:pos="2160"/>
+        </w:tabs>
+        <w:ind w:left="2160" w:hanging="360"/>
+      </w:pPr>
+      <w:rPr>
+        <w:rFonts w:ascii="Wingdings" w:hAnsi="Wingdings" w:hint="default"/>
+        <w:sz w:val="20"/>
+      </w:rPr>
+    </w:lvl>
+    <w:lvl w:ilvl="3" w:tentative="1">
+      <w:start w:val="1"/>
+      <w:numFmt w:val="bullet"/>
+      <w:lvlText w:val=""/>
+      <w:lvlJc w:val="left"/>
+      <w:pPr>
+        <w:tabs>
+          <w:tab w:val="num" w:pos="2880"/>
+        </w:tabs>
+        <w:ind w:left="2880" w:hanging="360"/>
+      </w:pPr>
+      <w:rPr>
+        <w:rFonts w:ascii="Wingdings" w:hAnsi="Wingdings" w:hint="default"/>
+        <w:sz w:val="20"/>
+      </w:rPr>
+    </w:lvl>
+    <w:lvl w:ilvl="4" w:tentative="1">
+      <w:start w:val="1"/>
+      <w:numFmt w:val="bullet"/>
+      <w:lvlText w:val=""/>
+      <w:lvlJc w:val="left"/>
+      <w:pPr>
+        <w:tabs>
+          <w:tab w:val="num" w:pos="3600"/>
+        </w:tabs>
+        <w:ind w:left="3600" w:hanging="360"/>
+      </w:pPr>
+      <w:rPr>
+        <w:rFonts w:ascii="Wingdings" w:hAnsi="Wingdings" w:hint="default"/>
+        <w:sz w:val="20"/>
+      </w:rPr>
+    </w:lvl>
+    <w:lvl w:ilvl="5" w:tentative="1">
+      <w:start w:val="1"/>
+      <w:numFmt w:val="bullet"/>
+      <w:lvlText w:val=""/>
+      <w:lvlJc w:val="left"/>
+      <w:pPr>
+        <w:tabs>
+          <w:tab w:val="num" w:pos="4320"/>
+        </w:tabs>
+        <w:ind w:left="4320" w:hanging="360"/>
+      </w:pPr>
+      <w:rPr>
+        <w:rFonts w:ascii="Wingdings" w:hAnsi="Wingdings" w:hint="default"/>
+        <w:sz w:val="20"/>
+      </w:rPr>
+    </w:lvl>
+    <w:lvl w:ilvl="6" w:tentative="1">
+      <w:start w:val="1"/>
+      <w:numFmt w:val="bullet"/>
+      <w:lvlText w:val=""/>
+      <w:lvlJc w:val="left"/>
+      <w:pPr>
+        <w:tabs>
+          <w:tab w:val="num" w:pos="5040"/>
+        </w:tabs>
+        <w:ind w:left="5040" w:hanging="360"/>
+      </w:pPr>
+      <w:rPr>
+        <w:rFonts w:ascii="Wingdings" w:hAnsi="Wingdings" w:hint="default"/>
+        <w:sz w:val="20"/>
+      </w:rPr>
+    </w:lvl>
+    <w:lvl w:ilvl="7" w:tentative="1">
+      <w:start w:val="1"/>
+      <w:numFmt w:val="bullet"/>
+      <w:lvlText w:val=""/>
+      <w:lvlJc w:val="left"/>
+      <w:pPr>
+        <w:tabs>
+          <w:tab w:val="num" w:pos="5760"/>
+        </w:tabs>
+        <w:ind w:left="5760" w:hanging="360"/>
+      </w:pPr>
+      <w:rPr>
+        <w:rFonts w:ascii="Wingdings" w:hAnsi="Wingdings" w:hint="default"/>
+        <w:sz w:val="20"/>
+      </w:rPr>
+    </w:lvl>
+    <w:lvl w:ilvl="8" w:tentative="1">
+      <w:start w:val="1"/>
+      <w:numFmt w:val="bullet"/>
+      <w:lvlText w:val=""/>
+      <w:lvlJc w:val="left"/>
+      <w:pPr>
+        <w:tabs>
+          <w:tab w:val="num" w:pos="6480"/>
+        </w:tabs>
+        <w:ind w:left="6480" w:hanging="360"/>
+      </w:pPr>
+      <w:rPr>
+        <w:rFonts w:ascii="Wingdings" w:hAnsi="Wingdings" w:hint="default"/>
+        <w:sz w:val="20"/>
+      </w:rPr>
+    </w:lvl>
+  </w:abstractNum>
+  <w:abstractNum w:abstractNumId="8" w15:restartNumberingAfterBreak="0">
     <w:nsid w:val="5D792984"/>
     <w:multiLevelType w:val="multilevel"/>
     <w:tmpl w:val="DE4C86FE"/>
@@ -3265,7 +3467,7 @@
       </w:pPr>
     </w:lvl>
   </w:abstractNum>
-  <w:abstractNum w:abstractNumId="8" w15:restartNumberingAfterBreak="0">
+  <w:abstractNum w:abstractNumId="9" w15:restartNumberingAfterBreak="0">
     <w:nsid w:val="5EA36ADE"/>
     <w:multiLevelType w:val="multilevel"/>
     <w:tmpl w:val="38244B0A"/>
@@ -3414,7 +3616,7 @@
       </w:rPr>
     </w:lvl>
   </w:abstractNum>
-  <w:abstractNum w:abstractNumId="9" w15:restartNumberingAfterBreak="0">
+  <w:abstractNum w:abstractNumId="10" w15:restartNumberingAfterBreak="0">
     <w:nsid w:val="699A02A3"/>
     <w:multiLevelType w:val="multilevel"/>
     <w:tmpl w:val="A9800E6C"/>
@@ -3563,7 +3765,7 @@
       </w:rPr>
     </w:lvl>
   </w:abstractNum>
-  <w:abstractNum w:abstractNumId="10" w15:restartNumberingAfterBreak="0">
+  <w:abstractNum w:abstractNumId="11" w15:restartNumberingAfterBreak="0">
     <w:nsid w:val="70471EE9"/>
     <w:multiLevelType w:val="multilevel"/>
     <w:tmpl w:val="19FA0E16"/>
@@ -3722,19 +3924,19 @@
     <w:abstractNumId w:val="3"/>
   </w:num>
   <w:num w:numId="4" w16cid:durableId="1913811710">
-    <w:abstractNumId w:val="10"/>
+    <w:abstractNumId w:val="11"/>
   </w:num>
   <w:num w:numId="5" w16cid:durableId="381179875">
     <w:abstractNumId w:val="6"/>
   </w:num>
   <w:num w:numId="6" w16cid:durableId="745684861">
-    <w:abstractNumId w:val="7"/>
+    <w:abstractNumId w:val="8"/>
   </w:num>
   <w:num w:numId="7" w16cid:durableId="525481843">
-    <w:abstractNumId w:val="8"/>
+    <w:abstractNumId w:val="9"/>
   </w:num>
   <w:num w:numId="8" w16cid:durableId="1536428602">
-    <w:abstractNumId w:val="9"/>
+    <w:abstractNumId w:val="10"/>
   </w:num>
   <w:num w:numId="9" w16cid:durableId="39743656">
     <w:abstractNumId w:val="0"/>
@@ -3744,6 +3946,9 @@
   </w:num>
   <w:num w:numId="11" w16cid:durableId="2062629396">
     <w:abstractNumId w:val="5"/>
+  </w:num>
+  <w:num w:numId="12" w16cid:durableId="2042706803">
+    <w:abstractNumId w:val="7"/>
   </w:num>
 </w:numbering>
 </file>
@@ -4341,7 +4546,6 @@
   <w:style w:type="character" w:default="1" w:styleId="Standardstycketeckensnitt">
     <w:name w:val="Default Paragraph Font"/>
     <w:uiPriority w:val="1"/>
-    <w:semiHidden/>
     <w:unhideWhenUsed/>
   </w:style>
   <w:style w:type="table" w:default="1" w:styleId="Normaltabell">

</xml_diff>